<commit_message>
fix(bl): Angebot-BL ohne BWT-/Duschwanne-Textblöcke, KK-Totals enden mit Gesamtsumme
Vorlage (manuell in Word bereinigt): die von BWT geerbten Blöcke
{#BwtSteelNoteEnabled}/{#BwtProxyNoteEnabled} und der Duschwannen-
Hinweis {#EbenerdigHinweis} sind entfernt — beide werden für ein
Badelift-Angebot nie befüllt.

Totals: bl wie bwt/hl von den Kassenkunden-Zeilen "Ihr voraussichtlicher
Zuschuss nach §40 SGB XI" und "Ihr Eigenanteil" ausgenommen. Die Tabelle
endet mit der Gesamtsumme; der Eigenanteil steht ohnehin darunter im
{#hasSubsidyLine}-Satz ("Der Selbstkostenanteil beträgt … unter
Berücksichtigung eines gewährten Zuschusses …").

Co-Authored-By: Claude Opus 5 <noreply@anthropic.com>
</commit_message>
<xml_diff>
--- a/src/templates/Angebot-BL.docx
+++ b/src/templates/Angebot-BL.docx
@@ -63,9 +63,9 @@
         <w:tblLook w:val="04a0" w:noVBand="1" w:noHBand="0" w:lastColumn="0" w:firstColumn="1" w:lastRow="0" w:firstRow="1"/>
       </w:tblPr>
       <w:tblGrid>
-        <w:gridCol w:w="4799"/>
+        <w:gridCol w:w="4797"/>
         <w:gridCol w:w="2268"/>
-        <w:gridCol w:w="2968"/>
+        <w:gridCol w:w="2970"/>
       </w:tblGrid>
       <w:tr>
         <w:trPr>
@@ -73,7 +73,7 @@
         </w:trPr>
         <w:tc>
           <w:tcPr>
-            <w:tcW w:w="4799" w:type="dxa"/>
+            <w:tcW w:w="4797" w:type="dxa"/>
             <w:tcBorders>
               <w:top w:val="single" w:sz="8" w:space="0" w:color="FFFFFF"/>
               <w:left w:val="single" w:sz="8" w:space="0" w:color="FFFFFF"/>
@@ -284,7 +284,7 @@
         </w:tc>
         <w:tc>
           <w:tcPr>
-            <w:tcW w:w="2968" w:type="dxa"/>
+            <w:tcW w:w="2970" w:type="dxa"/>
             <w:tcBorders>
               <w:top w:val="single" w:sz="8" w:space="0" w:color="FFFFFF"/>
               <w:left w:val="single" w:sz="8" w:space="0" w:color="FFFFFF"/>
@@ -521,7 +521,7 @@
         </w:trPr>
         <w:tc>
           <w:tcPr>
-            <w:tcW w:w="4799" w:type="dxa"/>
+            <w:tcW w:w="4797" w:type="dxa"/>
             <w:tcBorders>
               <w:top w:val="single" w:sz="8" w:space="0" w:color="FFFFFF"/>
               <w:left w:val="single" w:sz="8" w:space="0" w:color="FFFFFF"/>
@@ -556,7 +556,7 @@
         </w:tc>
         <w:tc>
           <w:tcPr>
-            <w:tcW w:w="5236" w:type="dxa"/>
+            <w:tcW w:w="5238" w:type="dxa"/>
             <w:gridSpan w:val="2"/>
             <w:tcBorders>
               <w:top w:val="single" w:sz="8" w:space="0" w:color="FFFFFF"/>
@@ -752,9 +752,9 @@
       <w:tblGrid>
         <w:gridCol w:w="510"/>
         <w:gridCol w:w="885"/>
-        <w:gridCol w:w="5855"/>
+        <w:gridCol w:w="5853"/>
         <w:gridCol w:w="1440"/>
-        <w:gridCol w:w="1255"/>
+        <w:gridCol w:w="1257"/>
       </w:tblGrid>
       <w:tr>
         <w:trPr>
@@ -828,7 +828,7 @@
         </w:tc>
         <w:tc>
           <w:tcPr>
-            <w:tcW w:w="5855" w:type="dxa"/>
+            <w:tcW w:w="5853" w:type="dxa"/>
             <w:tcBorders/>
             <w:shd w:color="auto" w:fill="CCCCCC" w:val="clear"/>
           </w:tcPr>
@@ -887,7 +887,7 @@
         </w:tc>
         <w:tc>
           <w:tcPr>
-            <w:tcW w:w="1255" w:type="dxa"/>
+            <w:tcW w:w="1257" w:type="dxa"/>
             <w:tcBorders/>
             <w:shd w:color="auto" w:fill="CCCCCC" w:val="clear"/>
           </w:tcPr>
@@ -982,7 +982,7 @@
         </w:tc>
         <w:tc>
           <w:tcPr>
-            <w:tcW w:w="5855" w:type="dxa"/>
+            <w:tcW w:w="5853" w:type="dxa"/>
             <w:tcBorders/>
             <w:shd w:color="auto" w:fill="FFFFFF" w:val="clear"/>
           </w:tcPr>
@@ -1046,7 +1046,7 @@
         </w:tc>
         <w:tc>
           <w:tcPr>
-            <w:tcW w:w="1255" w:type="dxa"/>
+            <w:tcW w:w="1257" w:type="dxa"/>
             <w:tcBorders/>
             <w:shd w:color="auto" w:fill="FFFFFF" w:val="clear"/>
           </w:tcPr>
@@ -1164,7 +1164,7 @@
         </w:tc>
         <w:tc>
           <w:tcPr>
-            <w:tcW w:w="5855" w:type="dxa"/>
+            <w:tcW w:w="5853" w:type="dxa"/>
             <w:tcBorders/>
             <w:shd w:color="auto" w:fill="FFFFFF" w:val="clear"/>
             <w:tcMar>
@@ -1452,7 +1452,7 @@
         </w:tc>
         <w:tc>
           <w:tcPr>
-            <w:tcW w:w="1255" w:type="dxa"/>
+            <w:tcW w:w="1257" w:type="dxa"/>
             <w:tcBorders/>
             <w:shd w:color="auto" w:fill="FFFFFF" w:val="clear"/>
             <w:tcMar>
@@ -1526,9 +1526,9 @@
       <w:tblGrid>
         <w:gridCol w:w="510"/>
         <w:gridCol w:w="885"/>
-        <w:gridCol w:w="5855"/>
+        <w:gridCol w:w="5853"/>
         <w:gridCol w:w="1440"/>
-        <w:gridCol w:w="1255"/>
+        <w:gridCol w:w="1257"/>
       </w:tblGrid>
       <w:tr>
         <w:trPr>
@@ -1597,7 +1597,7 @@
         </w:tc>
         <w:tc>
           <w:tcPr>
-            <w:tcW w:w="5855" w:type="dxa"/>
+            <w:tcW w:w="5853" w:type="dxa"/>
             <w:tcBorders/>
             <w:shd w:color="auto" w:fill="FFFFFF" w:val="clear"/>
           </w:tcPr>
@@ -1668,7 +1668,7 @@
         </w:tc>
         <w:tc>
           <w:tcPr>
-            <w:tcW w:w="1255" w:type="dxa"/>
+            <w:tcW w:w="1257" w:type="dxa"/>
             <w:tcBorders/>
             <w:shd w:color="auto" w:fill="FFFFFF" w:val="clear"/>
             <w:tcMar>
@@ -1757,7 +1757,7 @@
         </w:tc>
         <w:tc>
           <w:tcPr>
-            <w:tcW w:w="5855" w:type="dxa"/>
+            <w:tcW w:w="5853" w:type="dxa"/>
             <w:tcBorders/>
             <w:shd w:color="auto" w:fill="FFFFFF" w:val="clear"/>
           </w:tcPr>
@@ -1948,7 +1948,7 @@
         </w:tc>
         <w:tc>
           <w:tcPr>
-            <w:tcW w:w="1255" w:type="dxa"/>
+            <w:tcW w:w="1257" w:type="dxa"/>
             <w:tcBorders/>
             <w:shd w:color="auto" w:fill="FFFFFF" w:val="clear"/>
             <w:vAlign w:val="center"/>
@@ -2045,7 +2045,7 @@
         </w:tc>
         <w:tc>
           <w:tcPr>
-            <w:tcW w:w="5855" w:type="dxa"/>
+            <w:tcW w:w="5853" w:type="dxa"/>
             <w:tcBorders/>
             <w:shd w:color="auto" w:fill="FFFFFF" w:val="clear"/>
           </w:tcPr>
@@ -2136,7 +2136,7 @@
         </w:tc>
         <w:tc>
           <w:tcPr>
-            <w:tcW w:w="1255" w:type="dxa"/>
+            <w:tcW w:w="1257" w:type="dxa"/>
             <w:tcBorders/>
             <w:shd w:color="auto" w:fill="FFFFFF" w:val="clear"/>
           </w:tcPr>
@@ -2502,53 +2502,7 @@
           <w:color w:val="030303"/>
           <w:lang w:val="de-DE"/>
         </w:rPr>
-        <w:t>Es handelt sich hierbei um ein Festpreisangebot für die oben definierten Leistungen. Für eine Teilbeauftragung wäre ein neues Angebot erforderlich.{#EbenerdigHinweis}</w:t>
-      </w:r>
-    </w:p>
-    <w:p>
-      <w:pPr>
-        <w:pStyle w:val="normal1"/>
-        <w:spacing w:before="23" w:after="0"/>
-        <w:rPr>
-          <w:rFonts w:ascii="Open Sans" w:hAnsi="Open Sans" w:eastAsia="Open Sans" w:cs="Open Sans"/>
-          <w:color w:val="000000"/>
-          <w:lang w:val="de-DE"/>
-        </w:rPr>
-      </w:pPr>
-      <w:r>
-        <w:rPr>
-          <w:rFonts w:eastAsia="Open Sans" w:cs="Open Sans" w:ascii="Open Sans" w:hAnsi="Open Sans"/>
-          <w:color w:val="000000"/>
-          <w:lang w:val="de-DE"/>
-        </w:rPr>
-      </w:r>
-    </w:p>
-    <w:p>
-      <w:pPr>
-        <w:pStyle w:val="Normal"/>
-        <w:spacing w:lineRule="auto" w:line="286"/>
-        <w:ind w:left="123"/>
-        <w:rPr>
-          <w:rFonts w:ascii="Open Sans" w:hAnsi="Open Sans" w:eastAsia="Open Sans" w:cs="Open Sans"/>
-          <w:color w:val="000000"/>
-          <w:lang w:val="de-DE"/>
-        </w:rPr>
-      </w:pPr>
-      <w:r>
-        <w:rPr>
-          <w:rFonts w:eastAsia="Open Sans Semibold" w:cs="Open Sans Semibold" w:ascii="Open Sans Semibold" w:hAnsi="Open Sans Semibold"/>
-          <w:color w:val="030303"/>
-          <w:lang w:val="de-DE"/>
-        </w:rPr>
-        <w:t>HINWEIS:</w:t>
-      </w:r>
-      <w:r>
-        <w:rPr>
-          <w:rFonts w:eastAsia="Open Sans" w:cs="Open Sans" w:ascii="Open Sans" w:hAnsi="Open Sans"/>
-          <w:color w:val="030303"/>
-          <w:lang w:val="de-DE"/>
-        </w:rPr>
-        <w:t xml:space="preserve"> Ob eine ebenerdige Montage der Duschwanne möglich ist, kann erst nach dem Ausbau der bestehenden Wanne beurteilen werden. Sollten dabei zusätzliche oder weitere Leistungen erforderlich oder von Ihnen gewünscht sein, können zusätzliche Kosten entstehen.{/EbenerdigHinweis}</w:t>
+        <w:t>Es handelt sich hierbei um ein Festpreisangebot für die oben definierten Leistungen. Für eine Teilbeauftragung wäre ein neues Angebot erforderlich.</w:t>
       </w:r>
       <w:r>
         <w:rPr>
@@ -2664,77 +2618,6 @@
           <w:lang w:val="de-DE"/>
         </w:rPr>
         <w:t>{/IsTitle}{^IsTitle}{Text}{/IsTitle}{/SelfPayLines}</w:t>
-      </w:r>
-    </w:p>
-    <w:p>
-      <w:pPr>
-        <w:pStyle w:val="Normal"/>
-        <w:spacing w:before="1" w:after="0"/>
-        <w:ind w:hanging="5" w:left="125" w:right="-89"/>
-        <w:rPr>
-          <w:rFonts w:ascii="Open Sans" w:hAnsi="Open Sans"/>
-        </w:rPr>
-      </w:pPr>
-      <w:r>
-        <w:rPr>
-          <w:rFonts w:eastAsia="Open Sans" w:cs="Open Sans" w:ascii="Open Sans" w:hAnsi="Open Sans"/>
-          <w:color w:val="070707"/>
-          <w:lang w:val="de-DE"/>
-        </w:rPr>
-        <w:t>{#BwtSteelNoteEnabled}</w:t>
-      </w:r>
-    </w:p>
-    <w:p>
-      <w:pPr>
-        <w:pStyle w:val="Normal"/>
-        <w:spacing w:before="1" w:after="0"/>
-        <w:ind w:hanging="5" w:left="125" w:right="-89"/>
-        <w:rPr>
-          <w:rFonts w:ascii="Open Sans" w:hAnsi="Open Sans"/>
-        </w:rPr>
-      </w:pPr>
-      <w:r>
-        <w:rPr>
-          <w:rFonts w:eastAsia="Open Sans" w:cs="Open Sans" w:ascii="Open Sans" w:hAnsi="Open Sans"/>
-          <w:color w:val="070707"/>
-          <w:lang w:val="de-DE"/>
-        </w:rPr>
-        <w:t>{BwtSteelNote}</w:t>
-      </w:r>
-    </w:p>
-    <w:p>
-      <w:pPr>
-        <w:pStyle w:val="Normal"/>
-        <w:spacing w:before="1" w:after="0"/>
-        <w:ind w:hanging="5" w:left="125" w:right="-89"/>
-        <w:rPr>
-          <w:rFonts w:ascii="Open Sans" w:hAnsi="Open Sans"/>
-        </w:rPr>
-      </w:pPr>
-      <w:r>
-        <w:rPr>
-          <w:rFonts w:eastAsia="Open Sans" w:cs="Open Sans" w:ascii="Open Sans" w:hAnsi="Open Sans"/>
-          <w:color w:val="070707"/>
-          <w:lang w:val="de-DE"/>
-        </w:rPr>
-        <w:t>{/BwtSteelNoteEnabled}{#BwtProxyNoteEnabled}{BwtProxyNote}</w:t>
-      </w:r>
-    </w:p>
-    <w:p>
-      <w:pPr>
-        <w:pStyle w:val="Normal"/>
-        <w:spacing w:before="1" w:after="0"/>
-        <w:ind w:hanging="5" w:left="125" w:right="-89"/>
-        <w:rPr>
-          <w:rFonts w:ascii="Open Sans" w:hAnsi="Open Sans"/>
-        </w:rPr>
-      </w:pPr>
-      <w:r>
-        <w:rPr>
-          <w:rFonts w:ascii="Open Sans" w:hAnsi="Open Sans"/>
-          <w:color w:val="070707"/>
-        </w:rPr>
-        <w:t>{/BwtProxyNoteEnabled}</w:t>
       </w:r>
     </w:p>
     <w:p>
@@ -3555,7 +3438,7 @@
         <w:bCs w:val="false"/>
         <w:rFonts w:eastAsia="Open Sans" w:cs="Open Sans" w:ascii="Open Sans" w:hAnsi="Open Sans"/>
       </w:rPr>
-      <w:t>1</w:t>
+      <w:t>3</w:t>
     </w:r>
     <w:r>
       <w:rPr>
@@ -4135,7 +4018,7 @@
         <w:bCs w:val="false"/>
         <w:rFonts w:eastAsia="Open Sans" w:cs="Open Sans" w:ascii="Open Sans" w:hAnsi="Open Sans"/>
       </w:rPr>
-      <w:t>1</w:t>
+      <w:t>3</w:t>
     </w:r>
     <w:r>
       <w:rPr>

</xml_diff>